<commit_message>
Finalize user flow diagram report
</commit_message>
<xml_diff>
--- a/docs/Report/User Flow Diagrams.docx
+++ b/docs/Report/User Flow Diagrams.docx
@@ -15,34 +15,120 @@
         <w:pStyle w:val="Heading3"/>
       </w:pPr>
       <w:r>
-        <w:t xml:space="preserve">Story </w:t>
-      </w:r>
-      <w:proofErr w:type="spellStart"/>
-      <w:r>
-        <w:t>i</w:t>
-      </w:r>
-      <w:proofErr w:type="spellEnd"/>
+        <w:t>Feature</w:t>
+      </w:r>
+      <w:r>
+        <w:t xml:space="preserve"> </w:t>
+      </w:r>
+      <w:r>
+        <w:t>1</w:t>
+      </w:r>
     </w:p>
     <w:p>
       <w:pPr>
-        <w:pStyle w:val="Heading3"/>
-      </w:pPr>
-      <w:r>
-        <w:t>Story i</w:t>
-      </w:r>
-      <w:r>
-        <w:t>i</w:t>
+        <w:jc w:val="center"/>
+      </w:pPr>
+      <w:r>
+        <w:rPr>
+          <w:noProof/>
+        </w:rPr>
+        <w:drawing>
+          <wp:anchor distT="0" distB="0" distL="114300" distR="114300" simplePos="0" relativeHeight="251658240" behindDoc="0" locked="0" layoutInCell="1" allowOverlap="1" wp14:anchorId="39D9EBB7" wp14:editId="6EDAAB38">
+            <wp:simplePos x="0" y="0"/>
+            <wp:positionH relativeFrom="column">
+              <wp:posOffset>1145160</wp:posOffset>
+            </wp:positionH>
+            <wp:positionV relativeFrom="paragraph">
+              <wp:posOffset>4481375</wp:posOffset>
+            </wp:positionV>
+            <wp:extent cx="4710430" cy="3465830"/>
+            <wp:effectExtent l="0" t="0" r="0" b="1270"/>
+            <wp:wrapNone/>
+            <wp:docPr id="12" name="Picture 12"/>
+            <wp:cNvGraphicFramePr>
+              <a:graphicFrameLocks xmlns:a="http://schemas.openxmlformats.org/drawingml/2006/main" noChangeAspect="1"/>
+            </wp:cNvGraphicFramePr>
+            <a:graphic xmlns:a="http://schemas.openxmlformats.org/drawingml/2006/main">
+              <a:graphicData uri="http://schemas.openxmlformats.org/drawingml/2006/picture">
+                <pic:pic xmlns:pic="http://schemas.openxmlformats.org/drawingml/2006/picture">
+                  <pic:nvPicPr>
+                    <pic:cNvPr id="1" name=""/>
+                    <pic:cNvPicPr/>
+                  </pic:nvPicPr>
+                  <pic:blipFill>
+                    <a:blip r:embed="rId5">
+                      <a:extLst>
+                        <a:ext uri="{28A0092B-C50C-407E-A947-70E740481C1C}">
+                          <a14:useLocalDpi xmlns:a14="http://schemas.microsoft.com/office/drawing/2010/main" val="0"/>
+                        </a:ext>
+                      </a:extLst>
+                    </a:blip>
+                    <a:stretch>
+                      <a:fillRect/>
+                    </a:stretch>
+                  </pic:blipFill>
+                  <pic:spPr>
+                    <a:xfrm>
+                      <a:off x="0" y="0"/>
+                      <a:ext cx="4710430" cy="3465830"/>
+                    </a:xfrm>
+                    <a:prstGeom prst="rect">
+                      <a:avLst/>
+                    </a:prstGeom>
+                  </pic:spPr>
+                </pic:pic>
+              </a:graphicData>
+            </a:graphic>
+          </wp:anchor>
+        </w:drawing>
+      </w:r>
+      <w:r>
+        <w:rPr>
+          <w:noProof/>
+        </w:rPr>
+        <w:drawing>
+          <wp:inline distT="0" distB="0" distL="0" distR="0" wp14:anchorId="25E29C12" wp14:editId="1ED92C78">
+            <wp:extent cx="5309580" cy="4506686"/>
+            <wp:effectExtent l="0" t="0" r="5715" b="8255"/>
+            <wp:docPr id="11" name="Picture 11"/>
+            <wp:cNvGraphicFramePr>
+              <a:graphicFrameLocks xmlns:a="http://schemas.openxmlformats.org/drawingml/2006/main" noChangeAspect="1"/>
+            </wp:cNvGraphicFramePr>
+            <a:graphic xmlns:a="http://schemas.openxmlformats.org/drawingml/2006/main">
+              <a:graphicData uri="http://schemas.openxmlformats.org/drawingml/2006/picture">
+                <pic:pic xmlns:pic="http://schemas.openxmlformats.org/drawingml/2006/picture">
+                  <pic:nvPicPr>
+                    <pic:cNvPr id="1" name=""/>
+                    <pic:cNvPicPr/>
+                  </pic:nvPicPr>
+                  <pic:blipFill>
+                    <a:blip r:embed="rId6"/>
+                    <a:stretch>
+                      <a:fillRect/>
+                    </a:stretch>
+                  </pic:blipFill>
+                  <pic:spPr>
+                    <a:xfrm>
+                      <a:off x="0" y="0"/>
+                      <a:ext cx="5320792" cy="4516202"/>
+                    </a:xfrm>
+                    <a:prstGeom prst="rect">
+                      <a:avLst/>
+                    </a:prstGeom>
+                  </pic:spPr>
+                </pic:pic>
+              </a:graphicData>
+            </a:graphic>
+          </wp:inline>
+        </w:drawing>
       </w:r>
     </w:p>
     <w:p>
       <w:pPr>
-        <w:pStyle w:val="Heading3"/>
-      </w:pPr>
-      <w:r>
-        <w:t>Story i</w:t>
-      </w:r>
-      <w:r>
-        <w:t>ii</w:t>
+        <w:jc w:val="center"/>
+      </w:pPr>
+      <w:r>
+        <w:br w:type="page"/>
       </w:r>
     </w:p>
     <w:p>
@@ -50,21 +136,75 @@
         <w:pStyle w:val="Heading3"/>
       </w:pPr>
       <w:r>
-        <w:t>Story i</w:t>
-      </w:r>
-      <w:r>
-        <w:t>v</w:t>
+        <w:lastRenderedPageBreak/>
+        <w:t>Feature</w:t>
+      </w:r>
+      <w:r>
+        <w:t xml:space="preserve"> ii</w:t>
+      </w:r>
+      <w:r>
+        <w:t xml:space="preserve"> - </w:t>
+      </w:r>
+      <w:r>
+        <w:t>Login to your account</w:t>
       </w:r>
     </w:p>
     <w:p>
       <w:pPr>
-        <w:pStyle w:val="Heading3"/>
-      </w:pPr>
-      <w:r>
-        <w:t xml:space="preserve">Story </w:t>
-      </w:r>
-      <w:r>
-        <w:t>v</w:t>
+        <w:jc w:val="center"/>
+      </w:pPr>
+      <w:r>
+        <w:rPr>
+          <w:noProof/>
+        </w:rPr>
+        <w:drawing>
+          <wp:inline distT="0" distB="0" distL="0" distR="0" wp14:anchorId="685BAFD2" wp14:editId="2CD56646">
+            <wp:extent cx="3483882" cy="8577885"/>
+            <wp:effectExtent l="0" t="0" r="2540" b="0"/>
+            <wp:docPr id="1" name="Picture 1"/>
+            <wp:cNvGraphicFramePr>
+              <a:graphicFrameLocks xmlns:a="http://schemas.openxmlformats.org/drawingml/2006/main" noChangeAspect="1"/>
+            </wp:cNvGraphicFramePr>
+            <a:graphic xmlns:a="http://schemas.openxmlformats.org/drawingml/2006/main">
+              <a:graphicData uri="http://schemas.openxmlformats.org/drawingml/2006/picture">
+                <pic:pic xmlns:pic="http://schemas.openxmlformats.org/drawingml/2006/picture">
+                  <pic:nvPicPr>
+                    <pic:cNvPr id="0" name="Picture 1"/>
+                    <pic:cNvPicPr>
+                      <a:picLocks noChangeAspect="1" noChangeArrowheads="1"/>
+                    </pic:cNvPicPr>
+                  </pic:nvPicPr>
+                  <pic:blipFill>
+                    <a:blip r:embed="rId7">
+                      <a:extLst>
+                        <a:ext uri="{28A0092B-C50C-407E-A947-70E740481C1C}">
+                          <a14:useLocalDpi xmlns:a14="http://schemas.microsoft.com/office/drawing/2010/main" val="0"/>
+                        </a:ext>
+                      </a:extLst>
+                    </a:blip>
+                    <a:srcRect/>
+                    <a:stretch>
+                      <a:fillRect/>
+                    </a:stretch>
+                  </pic:blipFill>
+                  <pic:spPr bwMode="auto">
+                    <a:xfrm>
+                      <a:off x="0" y="0"/>
+                      <a:ext cx="3491634" cy="8596971"/>
+                    </a:xfrm>
+                    <a:prstGeom prst="rect">
+                      <a:avLst/>
+                    </a:prstGeom>
+                    <a:noFill/>
+                    <a:ln>
+                      <a:noFill/>
+                    </a:ln>
+                  </pic:spPr>
+                </pic:pic>
+              </a:graphicData>
+            </a:graphic>
+          </wp:inline>
+        </w:drawing>
       </w:r>
     </w:p>
     <w:p>
@@ -72,27 +212,99 @@
         <w:pStyle w:val="Heading3"/>
       </w:pPr>
       <w:r>
-        <w:t xml:space="preserve">Story </w:t>
-      </w:r>
-      <w:r>
-        <w:t>v</w:t>
-      </w:r>
-      <w:r>
-        <w:t>i</w:t>
+        <w:lastRenderedPageBreak/>
+        <w:t>Feature</w:t>
+      </w:r>
+      <w:r>
+        <w:t xml:space="preserve"> iii</w:t>
+      </w:r>
+      <w:r>
+        <w:t xml:space="preserve"> - </w:t>
+      </w:r>
+      <w:r>
+        <w:t>Add/</w:t>
+      </w:r>
+      <w:r>
+        <w:t xml:space="preserve"> </w:t>
+      </w:r>
+      <w:r>
+        <w:t>Edit/</w:t>
+      </w:r>
+      <w:r>
+        <w:t xml:space="preserve"> </w:t>
+      </w:r>
+      <w:r>
+        <w:t xml:space="preserve">Remove </w:t>
+      </w:r>
+      <w:r>
+        <w:t>I</w:t>
+      </w:r>
+      <w:r>
+        <w:t xml:space="preserve">tems </w:t>
+      </w:r>
+      <w:r>
+        <w:t>in A</w:t>
+      </w:r>
+      <w:r>
+        <w:t>ccount</w:t>
       </w:r>
     </w:p>
     <w:p>
       <w:pPr>
-        <w:pStyle w:val="Heading3"/>
-      </w:pPr>
-      <w:r>
-        <w:t xml:space="preserve">Story </w:t>
-      </w:r>
-      <w:r>
-        <w:t>vi</w:t>
-      </w:r>
-      <w:r>
-        <w:t>i</w:t>
+        <w:jc w:val="center"/>
+      </w:pPr>
+      <w:r>
+        <w:rPr>
+          <w:noProof/>
+        </w:rPr>
+        <w:drawing>
+          <wp:inline distT="0" distB="0" distL="0" distR="0" wp14:anchorId="5ABBE0FC" wp14:editId="2062708E">
+            <wp:extent cx="5494326" cy="6988629"/>
+            <wp:effectExtent l="0" t="0" r="0" b="3175"/>
+            <wp:docPr id="2" name="Picture 2"/>
+            <wp:cNvGraphicFramePr>
+              <a:graphicFrameLocks xmlns:a="http://schemas.openxmlformats.org/drawingml/2006/main" noChangeAspect="1"/>
+            </wp:cNvGraphicFramePr>
+            <a:graphic xmlns:a="http://schemas.openxmlformats.org/drawingml/2006/main">
+              <a:graphicData uri="http://schemas.openxmlformats.org/drawingml/2006/picture">
+                <pic:pic xmlns:pic="http://schemas.openxmlformats.org/drawingml/2006/picture">
+                  <pic:nvPicPr>
+                    <pic:cNvPr id="0" name="Picture 3"/>
+                    <pic:cNvPicPr>
+                      <a:picLocks noChangeAspect="1" noChangeArrowheads="1"/>
+                    </pic:cNvPicPr>
+                  </pic:nvPicPr>
+                  <pic:blipFill>
+                    <a:blip r:embed="rId8" cstate="print">
+                      <a:extLst>
+                        <a:ext uri="{28A0092B-C50C-407E-A947-70E740481C1C}">
+                          <a14:useLocalDpi xmlns:a14="http://schemas.microsoft.com/office/drawing/2010/main" val="0"/>
+                        </a:ext>
+                      </a:extLst>
+                    </a:blip>
+                    <a:srcRect/>
+                    <a:stretch>
+                      <a:fillRect/>
+                    </a:stretch>
+                  </pic:blipFill>
+                  <pic:spPr bwMode="auto">
+                    <a:xfrm>
+                      <a:off x="0" y="0"/>
+                      <a:ext cx="5500245" cy="6996157"/>
+                    </a:xfrm>
+                    <a:prstGeom prst="rect">
+                      <a:avLst/>
+                    </a:prstGeom>
+                    <a:noFill/>
+                    <a:ln>
+                      <a:noFill/>
+                    </a:ln>
+                  </pic:spPr>
+                </pic:pic>
+              </a:graphicData>
+            </a:graphic>
+          </wp:inline>
+        </w:drawing>
       </w:r>
     </w:p>
     <w:p>
@@ -100,24 +312,78 @@
         <w:pStyle w:val="Heading3"/>
       </w:pPr>
       <w:r>
-        <w:t xml:space="preserve">Story </w:t>
-      </w:r>
-      <w:r>
-        <w:t>vi</w:t>
-      </w:r>
-      <w:r>
-        <w:t>ii</w:t>
+        <w:lastRenderedPageBreak/>
+        <w:t>Feature</w:t>
+      </w:r>
+      <w:r>
+        <w:t xml:space="preserve"> iv</w:t>
+      </w:r>
+      <w:r>
+        <w:t xml:space="preserve"> - </w:t>
+      </w:r>
+      <w:r>
+        <w:t xml:space="preserve">Deposit Cash </w:t>
+      </w:r>
+      <w:r>
+        <w:t>Account</w:t>
       </w:r>
     </w:p>
     <w:p>
       <w:pPr>
-        <w:pStyle w:val="Heading3"/>
-      </w:pPr>
-      <w:r>
-        <w:t xml:space="preserve">Story </w:t>
-      </w:r>
-      <w:r>
-        <w:t>ix</w:t>
+        <w:jc w:val="center"/>
+      </w:pPr>
+      <w:r>
+        <w:rPr>
+          <w:noProof/>
+        </w:rPr>
+        <w:drawing>
+          <wp:inline distT="0" distB="0" distL="0" distR="0" wp14:anchorId="4FE94DF1" wp14:editId="3229FB5B">
+            <wp:extent cx="2807558" cy="8580664"/>
+            <wp:effectExtent l="0" t="0" r="0" b="0"/>
+            <wp:docPr id="3" name="Picture 3"/>
+            <wp:cNvGraphicFramePr>
+              <a:graphicFrameLocks xmlns:a="http://schemas.openxmlformats.org/drawingml/2006/main" noChangeAspect="1"/>
+            </wp:cNvGraphicFramePr>
+            <a:graphic xmlns:a="http://schemas.openxmlformats.org/drawingml/2006/main">
+              <a:graphicData uri="http://schemas.openxmlformats.org/drawingml/2006/picture">
+                <pic:pic xmlns:pic="http://schemas.openxmlformats.org/drawingml/2006/picture">
+                  <pic:nvPicPr>
+                    <pic:cNvPr id="0" name="Picture 5"/>
+                    <pic:cNvPicPr>
+                      <a:picLocks noChangeAspect="1" noChangeArrowheads="1"/>
+                    </pic:cNvPicPr>
+                  </pic:nvPicPr>
+                  <pic:blipFill>
+                    <a:blip r:embed="rId9">
+                      <a:extLst>
+                        <a:ext uri="{28A0092B-C50C-407E-A947-70E740481C1C}">
+                          <a14:useLocalDpi xmlns:a14="http://schemas.microsoft.com/office/drawing/2010/main" val="0"/>
+                        </a:ext>
+                      </a:extLst>
+                    </a:blip>
+                    <a:srcRect/>
+                    <a:stretch>
+                      <a:fillRect/>
+                    </a:stretch>
+                  </pic:blipFill>
+                  <pic:spPr bwMode="auto">
+                    <a:xfrm>
+                      <a:off x="0" y="0"/>
+                      <a:ext cx="2809279" cy="8585924"/>
+                    </a:xfrm>
+                    <a:prstGeom prst="rect">
+                      <a:avLst/>
+                    </a:prstGeom>
+                    <a:noFill/>
+                    <a:ln>
+                      <a:noFill/>
+                    </a:ln>
+                  </pic:spPr>
+                </pic:pic>
+              </a:graphicData>
+            </a:graphic>
+          </wp:inline>
+        </w:drawing>
       </w:r>
     </w:p>
     <w:p>
@@ -125,24 +391,81 @@
         <w:pStyle w:val="Heading3"/>
       </w:pPr>
       <w:r>
-        <w:t xml:space="preserve">Story </w:t>
-      </w:r>
-      <w:r>
-        <w:t>x</w:t>
+        <w:lastRenderedPageBreak/>
+        <w:t>Feature</w:t>
+      </w:r>
+      <w:r>
+        <w:t xml:space="preserve"> v</w:t>
+      </w:r>
+      <w:r>
+        <w:t xml:space="preserve"> - </w:t>
+      </w:r>
+      <w:r>
+        <w:t xml:space="preserve">Search for </w:t>
+      </w:r>
+      <w:r>
+        <w:t>I</w:t>
+      </w:r>
+      <w:r>
+        <w:t>tems</w:t>
       </w:r>
     </w:p>
     <w:p>
       <w:pPr>
-        <w:pStyle w:val="Heading3"/>
-      </w:pPr>
-      <w:r>
-        <w:t xml:space="preserve">Story </w:t>
-      </w:r>
-      <w:r>
-        <w:t>x</w:t>
-      </w:r>
-      <w:r>
-        <w:t>i</w:t>
+        <w:jc w:val="center"/>
+      </w:pPr>
+      <w:r>
+        <w:rPr>
+          <w:noProof/>
+        </w:rPr>
+        <w:drawing>
+          <wp:inline distT="0" distB="0" distL="0" distR="0" wp14:anchorId="59822CB4" wp14:editId="1E5A0BBE">
+            <wp:extent cx="5274310" cy="5988050"/>
+            <wp:effectExtent l="0" t="0" r="2540" b="0"/>
+            <wp:docPr id="6" name="Picture 6"/>
+            <wp:cNvGraphicFramePr>
+              <a:graphicFrameLocks xmlns:a="http://schemas.openxmlformats.org/drawingml/2006/main" noChangeAspect="1"/>
+            </wp:cNvGraphicFramePr>
+            <a:graphic xmlns:a="http://schemas.openxmlformats.org/drawingml/2006/main">
+              <a:graphicData uri="http://schemas.openxmlformats.org/drawingml/2006/picture">
+                <pic:pic xmlns:pic="http://schemas.openxmlformats.org/drawingml/2006/picture">
+                  <pic:nvPicPr>
+                    <pic:cNvPr id="0" name="Picture 11"/>
+                    <pic:cNvPicPr>
+                      <a:picLocks noChangeAspect="1" noChangeArrowheads="1"/>
+                    </pic:cNvPicPr>
+                  </pic:nvPicPr>
+                  <pic:blipFill>
+                    <a:blip r:embed="rId10">
+                      <a:extLst>
+                        <a:ext uri="{28A0092B-C50C-407E-A947-70E740481C1C}">
+                          <a14:useLocalDpi xmlns:a14="http://schemas.microsoft.com/office/drawing/2010/main" val="0"/>
+                        </a:ext>
+                      </a:extLst>
+                    </a:blip>
+                    <a:srcRect/>
+                    <a:stretch>
+                      <a:fillRect/>
+                    </a:stretch>
+                  </pic:blipFill>
+                  <pic:spPr bwMode="auto">
+                    <a:xfrm>
+                      <a:off x="0" y="0"/>
+                      <a:ext cx="5274310" cy="5988050"/>
+                    </a:xfrm>
+                    <a:prstGeom prst="rect">
+                      <a:avLst/>
+                    </a:prstGeom>
+                    <a:noFill/>
+                    <a:ln>
+                      <a:noFill/>
+                    </a:ln>
+                  </pic:spPr>
+                </pic:pic>
+              </a:graphicData>
+            </a:graphic>
+          </wp:inline>
+        </w:drawing>
       </w:r>
     </w:p>
     <w:p>
@@ -150,16 +473,399 @@
         <w:pStyle w:val="Heading3"/>
       </w:pPr>
       <w:r>
-        <w:t xml:space="preserve">Story </w:t>
+        <w:lastRenderedPageBreak/>
+        <w:t>Feature</w:t>
+      </w:r>
+      <w:r>
+        <w:t xml:space="preserve"> vi</w:t>
+      </w:r>
+      <w:r>
+        <w:t xml:space="preserve"> - </w:t>
+      </w:r>
+      <w:r>
+        <w:t xml:space="preserve">Purchase </w:t>
+      </w:r>
+      <w:r>
+        <w:t>I</w:t>
+      </w:r>
+      <w:r>
+        <w:t>tem</w:t>
+      </w:r>
+    </w:p>
+    <w:p>
+      <w:pPr>
+        <w:jc w:val="center"/>
+      </w:pPr>
+      <w:r>
+        <w:rPr>
+          <w:noProof/>
+        </w:rPr>
+        <w:drawing>
+          <wp:inline distT="0" distB="0" distL="0" distR="0" wp14:anchorId="0393B634" wp14:editId="13BEA4B1">
+            <wp:extent cx="2994605" cy="8544295"/>
+            <wp:effectExtent l="0" t="0" r="0" b="0"/>
+            <wp:docPr id="4" name="Picture 4"/>
+            <wp:cNvGraphicFramePr>
+              <a:graphicFrameLocks xmlns:a="http://schemas.openxmlformats.org/drawingml/2006/main" noChangeAspect="1"/>
+            </wp:cNvGraphicFramePr>
+            <a:graphic xmlns:a="http://schemas.openxmlformats.org/drawingml/2006/main">
+              <a:graphicData uri="http://schemas.openxmlformats.org/drawingml/2006/picture">
+                <pic:pic xmlns:pic="http://schemas.openxmlformats.org/drawingml/2006/picture">
+                  <pic:nvPicPr>
+                    <pic:cNvPr id="0" name="Picture 7"/>
+                    <pic:cNvPicPr>
+                      <a:picLocks noChangeAspect="1" noChangeArrowheads="1"/>
+                    </pic:cNvPicPr>
+                  </pic:nvPicPr>
+                  <pic:blipFill>
+                    <a:blip r:embed="rId11" cstate="print">
+                      <a:extLst>
+                        <a:ext uri="{28A0092B-C50C-407E-A947-70E740481C1C}">
+                          <a14:useLocalDpi xmlns:a14="http://schemas.microsoft.com/office/drawing/2010/main" val="0"/>
+                        </a:ext>
+                      </a:extLst>
+                    </a:blip>
+                    <a:srcRect/>
+                    <a:stretch>
+                      <a:fillRect/>
+                    </a:stretch>
+                  </pic:blipFill>
+                  <pic:spPr bwMode="auto">
+                    <a:xfrm>
+                      <a:off x="0" y="0"/>
+                      <a:ext cx="2997922" cy="8553758"/>
+                    </a:xfrm>
+                    <a:prstGeom prst="rect">
+                      <a:avLst/>
+                    </a:prstGeom>
+                    <a:noFill/>
+                    <a:ln>
+                      <a:noFill/>
+                    </a:ln>
+                  </pic:spPr>
+                </pic:pic>
+              </a:graphicData>
+            </a:graphic>
+          </wp:inline>
+        </w:drawing>
+      </w:r>
+    </w:p>
+    <w:p>
+      <w:pPr>
+        <w:pStyle w:val="Heading3"/>
+      </w:pPr>
+      <w:r>
+        <w:lastRenderedPageBreak/>
+        <w:t>Feature</w:t>
+      </w:r>
+      <w:r>
+        <w:t xml:space="preserve"> vii</w:t>
+      </w:r>
+      <w:r>
+        <w:t xml:space="preserve"> - </w:t>
+      </w:r>
+      <w:r>
+        <w:t xml:space="preserve">View </w:t>
+      </w:r>
+      <w:r>
+        <w:t>A</w:t>
+      </w:r>
+      <w:r>
+        <w:t xml:space="preserve">ccount </w:t>
+      </w:r>
+      <w:r>
+        <w:t>I</w:t>
+      </w:r>
+      <w:r>
+        <w:t>nfo</w:t>
+      </w:r>
+    </w:p>
+    <w:p>
+      <w:r>
+        <w:rPr>
+          <w:noProof/>
+        </w:rPr>
+        <w:drawing>
+          <wp:inline distT="0" distB="0" distL="0" distR="0" wp14:anchorId="78EE470D" wp14:editId="7F4D7E25">
+            <wp:extent cx="5274310" cy="6973570"/>
+            <wp:effectExtent l="0" t="0" r="2540" b="0"/>
+            <wp:docPr id="8" name="Picture 8"/>
+            <wp:cNvGraphicFramePr>
+              <a:graphicFrameLocks xmlns:a="http://schemas.openxmlformats.org/drawingml/2006/main" noChangeAspect="1"/>
+            </wp:cNvGraphicFramePr>
+            <a:graphic xmlns:a="http://schemas.openxmlformats.org/drawingml/2006/main">
+              <a:graphicData uri="http://schemas.openxmlformats.org/drawingml/2006/picture">
+                <pic:pic xmlns:pic="http://schemas.openxmlformats.org/drawingml/2006/picture">
+                  <pic:nvPicPr>
+                    <pic:cNvPr id="0" name="Picture 15"/>
+                    <pic:cNvPicPr>
+                      <a:picLocks noChangeAspect="1" noChangeArrowheads="1"/>
+                    </pic:cNvPicPr>
+                  </pic:nvPicPr>
+                  <pic:blipFill>
+                    <a:blip r:embed="rId12">
+                      <a:extLst>
+                        <a:ext uri="{28A0092B-C50C-407E-A947-70E740481C1C}">
+                          <a14:useLocalDpi xmlns:a14="http://schemas.microsoft.com/office/drawing/2010/main" val="0"/>
+                        </a:ext>
+                      </a:extLst>
+                    </a:blip>
+                    <a:srcRect/>
+                    <a:stretch>
+                      <a:fillRect/>
+                    </a:stretch>
+                  </pic:blipFill>
+                  <pic:spPr bwMode="auto">
+                    <a:xfrm>
+                      <a:off x="0" y="0"/>
+                      <a:ext cx="5274310" cy="6973570"/>
+                    </a:xfrm>
+                    <a:prstGeom prst="rect">
+                      <a:avLst/>
+                    </a:prstGeom>
+                    <a:noFill/>
+                    <a:ln>
+                      <a:noFill/>
+                    </a:ln>
+                  </pic:spPr>
+                </pic:pic>
+              </a:graphicData>
+            </a:graphic>
+          </wp:inline>
+        </w:drawing>
+      </w:r>
+    </w:p>
+    <w:p>
+      <w:pPr>
+        <w:pStyle w:val="Heading3"/>
+      </w:pPr>
+      <w:r>
+        <w:lastRenderedPageBreak/>
+        <w:t>Feature</w:t>
+      </w:r>
+      <w:r>
+        <w:t xml:space="preserve"> viii</w:t>
+      </w:r>
+      <w:r>
+        <w:t xml:space="preserve"> - </w:t>
+      </w:r>
+      <w:r>
+        <w:t xml:space="preserve">Manage </w:t>
+      </w:r>
+      <w:r>
+        <w:t>I</w:t>
+      </w:r>
+      <w:r>
+        <w:t>nventory</w:t>
+      </w:r>
+    </w:p>
+    <w:p>
+      <w:pPr>
+        <w:jc w:val="center"/>
+      </w:pPr>
+      <w:r>
+        <w:rPr>
+          <w:noProof/>
+        </w:rPr>
+        <w:drawing>
+          <wp:inline distT="0" distB="0" distL="0" distR="0" wp14:anchorId="28CA4824" wp14:editId="01576664">
+            <wp:extent cx="3584919" cy="8531679"/>
+            <wp:effectExtent l="0" t="0" r="0" b="3175"/>
+            <wp:docPr id="5" name="Picture 5"/>
+            <wp:cNvGraphicFramePr>
+              <a:graphicFrameLocks xmlns:a="http://schemas.openxmlformats.org/drawingml/2006/main" noChangeAspect="1"/>
+            </wp:cNvGraphicFramePr>
+            <a:graphic xmlns:a="http://schemas.openxmlformats.org/drawingml/2006/main">
+              <a:graphicData uri="http://schemas.openxmlformats.org/drawingml/2006/picture">
+                <pic:pic xmlns:pic="http://schemas.openxmlformats.org/drawingml/2006/picture">
+                  <pic:nvPicPr>
+                    <pic:cNvPr id="0" name="Picture 9"/>
+                    <pic:cNvPicPr>
+                      <a:picLocks noChangeAspect="1" noChangeArrowheads="1"/>
+                    </pic:cNvPicPr>
+                  </pic:nvPicPr>
+                  <pic:blipFill>
+                    <a:blip r:embed="rId13">
+                      <a:extLst>
+                        <a:ext uri="{28A0092B-C50C-407E-A947-70E740481C1C}">
+                          <a14:useLocalDpi xmlns:a14="http://schemas.microsoft.com/office/drawing/2010/main" val="0"/>
+                        </a:ext>
+                      </a:extLst>
+                    </a:blip>
+                    <a:srcRect/>
+                    <a:stretch>
+                      <a:fillRect/>
+                    </a:stretch>
+                  </pic:blipFill>
+                  <pic:spPr bwMode="auto">
+                    <a:xfrm>
+                      <a:off x="0" y="0"/>
+                      <a:ext cx="3586452" cy="8535328"/>
+                    </a:xfrm>
+                    <a:prstGeom prst="rect">
+                      <a:avLst/>
+                    </a:prstGeom>
+                    <a:noFill/>
+                    <a:ln>
+                      <a:noFill/>
+                    </a:ln>
+                  </pic:spPr>
+                </pic:pic>
+              </a:graphicData>
+            </a:graphic>
+          </wp:inline>
+        </w:drawing>
+      </w:r>
+    </w:p>
+    <w:p>
+      <w:pPr>
+        <w:pStyle w:val="Heading3"/>
+      </w:pPr>
+      <w:r>
+        <w:lastRenderedPageBreak/>
+        <w:t>Feature</w:t>
+      </w:r>
+      <w:r>
+        <w:t xml:space="preserve"> </w:t>
+      </w:r>
+      <w:r>
+        <w:t xml:space="preserve">ix - </w:t>
+      </w:r>
+      <w:r>
+        <w:t xml:space="preserve">Generate </w:t>
+      </w:r>
+      <w:r>
+        <w:t>Reports</w:t>
+      </w:r>
+    </w:p>
+    <w:p>
+      <w:r>
+        <w:rPr>
+          <w:noProof/>
+        </w:rPr>
+        <w:drawing>
+          <wp:inline distT="0" distB="0" distL="0" distR="0" wp14:anchorId="42BE5DE3" wp14:editId="3C88026B">
+            <wp:extent cx="5274310" cy="7404735"/>
+            <wp:effectExtent l="0" t="0" r="2540" b="5715"/>
+            <wp:docPr id="7" name="Picture 7"/>
+            <wp:cNvGraphicFramePr>
+              <a:graphicFrameLocks xmlns:a="http://schemas.openxmlformats.org/drawingml/2006/main" noChangeAspect="1"/>
+            </wp:cNvGraphicFramePr>
+            <a:graphic xmlns:a="http://schemas.openxmlformats.org/drawingml/2006/main">
+              <a:graphicData uri="http://schemas.openxmlformats.org/drawingml/2006/picture">
+                <pic:pic xmlns:pic="http://schemas.openxmlformats.org/drawingml/2006/picture">
+                  <pic:nvPicPr>
+                    <pic:cNvPr id="0" name="Picture 13"/>
+                    <pic:cNvPicPr>
+                      <a:picLocks noChangeAspect="1" noChangeArrowheads="1"/>
+                    </pic:cNvPicPr>
+                  </pic:nvPicPr>
+                  <pic:blipFill>
+                    <a:blip r:embed="rId14">
+                      <a:extLst>
+                        <a:ext uri="{28A0092B-C50C-407E-A947-70E740481C1C}">
+                          <a14:useLocalDpi xmlns:a14="http://schemas.microsoft.com/office/drawing/2010/main" val="0"/>
+                        </a:ext>
+                      </a:extLst>
+                    </a:blip>
+                    <a:srcRect/>
+                    <a:stretch>
+                      <a:fillRect/>
+                    </a:stretch>
+                  </pic:blipFill>
+                  <pic:spPr bwMode="auto">
+                    <a:xfrm>
+                      <a:off x="0" y="0"/>
+                      <a:ext cx="5274310" cy="7404735"/>
+                    </a:xfrm>
+                    <a:prstGeom prst="rect">
+                      <a:avLst/>
+                    </a:prstGeom>
+                    <a:noFill/>
+                    <a:ln>
+                      <a:noFill/>
+                    </a:ln>
+                  </pic:spPr>
+                </pic:pic>
+              </a:graphicData>
+            </a:graphic>
+          </wp:inline>
+        </w:drawing>
+      </w:r>
+    </w:p>
+    <w:p>
+      <w:pPr>
+        <w:pStyle w:val="Heading3"/>
+      </w:pPr>
+      <w:r>
+        <w:lastRenderedPageBreak/>
+        <w:t xml:space="preserve">Feature </w:t>
       </w:r>
       <w:r>
         <w:t>x</w:t>
       </w:r>
       <w:r>
-        <w:t>ii</w:t>
+        <w:t xml:space="preserve"> – Interfacing External Stores</w:t>
       </w:r>
     </w:p>
-    <w:p/>
+    <w:p>
+      <w:pPr>
+        <w:jc w:val="center"/>
+      </w:pPr>
+      <w:r>
+        <w:rPr>
+          <w:noProof/>
+        </w:rPr>
+        <w:drawing>
+          <wp:inline distT="0" distB="0" distL="0" distR="0" wp14:anchorId="1C0873BD" wp14:editId="69E4B25E">
+            <wp:extent cx="3697847" cy="8499021"/>
+            <wp:effectExtent l="0" t="0" r="0" b="0"/>
+            <wp:docPr id="9" name="Picture 9"/>
+            <wp:cNvGraphicFramePr>
+              <a:graphicFrameLocks xmlns:a="http://schemas.openxmlformats.org/drawingml/2006/main" noChangeAspect="1"/>
+            </wp:cNvGraphicFramePr>
+            <a:graphic xmlns:a="http://schemas.openxmlformats.org/drawingml/2006/main">
+              <a:graphicData uri="http://schemas.openxmlformats.org/drawingml/2006/picture">
+                <pic:pic xmlns:pic="http://schemas.openxmlformats.org/drawingml/2006/picture">
+                  <pic:nvPicPr>
+                    <pic:cNvPr id="0" name="Picture 17"/>
+                    <pic:cNvPicPr>
+                      <a:picLocks noChangeAspect="1" noChangeArrowheads="1"/>
+                    </pic:cNvPicPr>
+                  </pic:nvPicPr>
+                  <pic:blipFill>
+                    <a:blip r:embed="rId15" cstate="print">
+                      <a:extLst>
+                        <a:ext uri="{28A0092B-C50C-407E-A947-70E740481C1C}">
+                          <a14:useLocalDpi xmlns:a14="http://schemas.microsoft.com/office/drawing/2010/main" val="0"/>
+                        </a:ext>
+                      </a:extLst>
+                    </a:blip>
+                    <a:srcRect/>
+                    <a:stretch>
+                      <a:fillRect/>
+                    </a:stretch>
+                  </pic:blipFill>
+                  <pic:spPr bwMode="auto">
+                    <a:xfrm>
+                      <a:off x="0" y="0"/>
+                      <a:ext cx="3698747" cy="8501090"/>
+                    </a:xfrm>
+                    <a:prstGeom prst="rect">
+                      <a:avLst/>
+                    </a:prstGeom>
+                    <a:noFill/>
+                    <a:ln>
+                      <a:noFill/>
+                    </a:ln>
+                  </pic:spPr>
+                </pic:pic>
+              </a:graphicData>
+            </a:graphic>
+          </wp:inline>
+        </w:drawing>
+      </w:r>
+    </w:p>
     <w:p/>
     <w:sectPr>
       <w:pgSz w:w="11906" w:h="16838"/>

</xml_diff>